<commit_message>
Update investor content for 2026-08-19
</commit_message>
<xml_diff>
--- a/public/investor-downloads/daily-brief-latest.docx
+++ b/public/investor-downloads/daily-brief-latest.docx
@@ -8,7 +8,7 @@
       </w:pPr>
       <w:r>
         <w:rPr>
-          <w:rFonts w:ascii="Calibri" w:hAnsi="Calibri" w:eastAsia="Songti SC"/>
+          <w:rFonts w:ascii="Calibri" w:hAnsi="Calibri" w:eastAsia="Arial Unicode MS"/>
           <w:b/>
           <w:i w:val="0"/>
           <w:color w:val="285B9D"/>
@@ -24,7 +24,7 @@
       </w:pPr>
       <w:r>
         <w:rPr>
-          <w:rFonts w:ascii="Calibri" w:hAnsi="Calibri" w:eastAsia="Songti SC"/>
+          <w:rFonts w:ascii="Calibri" w:hAnsi="Calibri" w:eastAsia="Arial Unicode MS"/>
           <w:b w:val="0"/>
           <w:i w:val="0"/>
         </w:rPr>
@@ -38,11 +38,11 @@
       </w:pPr>
       <w:r>
         <w:rPr>
-          <w:rFonts w:ascii="Calibri" w:hAnsi="Calibri" w:eastAsia="Songti SC"/>
+          <w:rFonts w:ascii="Calibri" w:hAnsi="Calibri" w:eastAsia="Arial Unicode MS"/>
           <w:b w:val="0"/>
           <w:i w:val="0"/>
         </w:rPr>
-        <w:t>2026-08-18 · webpage screenshot DOCX edition</w:t>
+        <w:t>2026-08-19 · webpage screenshot DOCX edition</w:t>
       </w:r>
     </w:p>
     <w:p>
@@ -51,7 +51,7 @@
       </w:pPr>
       <w:r>
         <w:rPr>
-          <w:rFonts w:ascii="Calibri" w:hAnsi="Calibri" w:eastAsia="Songti SC"/>
+          <w:rFonts w:ascii="Calibri" w:hAnsi="Calibri" w:eastAsia="Arial Unicode MS"/>
           <w:b/>
           <w:i w:val="0"/>
           <w:color w:val="0B2545"/>
@@ -66,13 +66,13 @@
       </w:pPr>
       <w:r>
         <w:rPr>
-          <w:rFonts w:ascii="Calibri" w:hAnsi="Calibri" w:eastAsia="Songti SC"/>
+          <w:rFonts w:ascii="Calibri" w:hAnsi="Calibri" w:eastAsia="Arial Unicode MS"/>
           <w:b w:val="0"/>
           <w:i w:val="0"/>
           <w:color w:val="334155"/>
           <w:sz w:val="22"/>
         </w:rPr>
-        <w:t>2026-08-18 共纳入 1 篇中文研究结果，覆盖 0 位活跃分析师和 2 条主要行业链，较 2026-08-17 的主题变化可在右侧动量表中核对。简报优先呈现可被报告链接追溯的结论，而不是孤立摘要。</w:t>
+        <w:t>2026-08-19 共纳入 1 篇中文研究结果，覆盖 0 位活跃分析师和 1 条主要行业链，较 2026-08-18 的主题变化可在右侧动量表中核对。简报优先呈现可被报告链接追溯的结论，而不是孤立摘要。</w:t>
       </w:r>
     </w:p>
     <w:tbl>
@@ -101,7 +101,7 @@
             </w:pPr>
             <w:r>
               <w:rPr>
-                <w:rFonts w:ascii="Calibri" w:hAnsi="Calibri" w:eastAsia="Songti SC"/>
+                <w:rFonts w:ascii="Calibri" w:hAnsi="Calibri" w:eastAsia="Arial Unicode MS"/>
                 <w:b/>
                 <w:color w:val="667085"/>
                 <w:sz w:val="17"/>
@@ -111,7 +111,7 @@
             </w:r>
             <w:r>
               <w:rPr>
-                <w:rFonts w:ascii="Calibri" w:hAnsi="Calibri" w:eastAsia="Songti SC"/>
+                <w:rFonts w:ascii="Calibri" w:hAnsi="Calibri" w:eastAsia="Arial Unicode MS"/>
                 <w:b/>
                 <w:color w:val="285B9D"/>
                 <w:sz w:val="36"/>
@@ -132,7 +132,7 @@
             </w:pPr>
             <w:r>
               <w:rPr>
-                <w:rFonts w:ascii="Calibri" w:hAnsi="Calibri" w:eastAsia="Songti SC"/>
+                <w:rFonts w:ascii="Calibri" w:hAnsi="Calibri" w:eastAsia="Arial Unicode MS"/>
                 <w:b/>
                 <w:color w:val="667085"/>
                 <w:sz w:val="17"/>
@@ -142,7 +142,7 @@
             </w:r>
             <w:r>
               <w:rPr>
-                <w:rFonts w:ascii="Calibri" w:hAnsi="Calibri" w:eastAsia="Songti SC"/>
+                <w:rFonts w:ascii="Calibri" w:hAnsi="Calibri" w:eastAsia="Arial Unicode MS"/>
                 <w:b/>
                 <w:color w:val="237A5B"/>
                 <w:sz w:val="36"/>
@@ -163,7 +163,7 @@
             </w:pPr>
             <w:r>
               <w:rPr>
-                <w:rFonts w:ascii="Calibri" w:hAnsi="Calibri" w:eastAsia="Songti SC"/>
+                <w:rFonts w:ascii="Calibri" w:hAnsi="Calibri" w:eastAsia="Arial Unicode MS"/>
                 <w:b/>
                 <w:color w:val="667085"/>
                 <w:sz w:val="17"/>
@@ -173,12 +173,12 @@
             </w:r>
             <w:r>
               <w:rPr>
-                <w:rFonts w:ascii="Calibri" w:hAnsi="Calibri" w:eastAsia="Songti SC"/>
+                <w:rFonts w:ascii="Calibri" w:hAnsi="Calibri" w:eastAsia="Arial Unicode MS"/>
                 <w:b/>
                 <w:color w:val="A8731B"/>
                 <w:sz w:val="36"/>
               </w:rPr>
-              <w:t>2</w:t>
+              <w:t>1</w:t>
             </w:r>
           </w:p>
         </w:tc>
@@ -194,7 +194,7 @@
             </w:pPr>
             <w:r>
               <w:rPr>
-                <w:rFonts w:ascii="Calibri" w:hAnsi="Calibri" w:eastAsia="Songti SC"/>
+                <w:rFonts w:ascii="Calibri" w:hAnsi="Calibri" w:eastAsia="Arial Unicode MS"/>
                 <w:b/>
                 <w:color w:val="667085"/>
                 <w:sz w:val="17"/>
@@ -204,7 +204,7 @@
             </w:r>
             <w:r>
               <w:rPr>
-                <w:rFonts w:ascii="Calibri" w:hAnsi="Calibri" w:eastAsia="Songti SC"/>
+                <w:rFonts w:ascii="Calibri" w:hAnsi="Calibri" w:eastAsia="Arial Unicode MS"/>
                 <w:b/>
                 <w:color w:val="B43D49"/>
                 <w:sz w:val="36"/>
@@ -237,7 +237,7 @@
               <a:graphicData uri="http://schemas.openxmlformats.org/drawingml/2006/picture">
                 <pic:pic>
                   <pic:nvPicPr>
-                    <pic:cNvPr id="0" name="daily-brief-2026-08-18-web-summary.png"/>
+                    <pic:cNvPr id="0" name="daily-brief-2026-08-19-web-summary.png"/>
                     <pic:cNvPicPr/>
                   </pic:nvPicPr>
                   <pic:blipFill>
@@ -268,7 +268,7 @@
       </w:pPr>
       <w:r>
         <w:rPr>
-          <w:rFonts w:ascii="Calibri" w:hAnsi="Calibri" w:eastAsia="Songti SC"/>
+          <w:rFonts w:ascii="Calibri" w:hAnsi="Calibri" w:eastAsia="Arial Unicode MS"/>
           <w:b w:val="0"/>
           <w:i/>
           <w:color w:val="667085"/>
@@ -292,7 +292,7 @@
       </w:pPr>
       <w:r>
         <w:rPr>
-          <w:rFonts w:ascii="Calibri" w:hAnsi="Calibri" w:eastAsia="Songti SC"/>
+          <w:rFonts w:ascii="Calibri" w:hAnsi="Calibri" w:eastAsia="Arial Unicode MS"/>
           <w:b/>
           <w:color w:val="285B9D"/>
           <w:sz w:val="21"/>
@@ -304,9 +304,9 @@
           <w:rPr>
             <w:color w:val="285B9D"/>
             <w:u w:val="single"/>
-            <w:rFonts w:eastAsia="Songti SC" w:ascii="Calibri" w:hAnsi="Calibri"/>
+            <w:rFonts w:eastAsia="Arial Unicode MS" w:ascii="Calibri" w:hAnsi="Calibri"/>
           </w:rPr>
-          <w:t>SQM 近端催化剂 是今日最高权重结论，核心证据来自 未识别，关联 AI 基础设施。</w:t>
+          <w:t>research discussion Session Brief 是今日最高权重结论，核心证据来自 未识别，关联 宏观通胀传导。</w:t>
         </w:r>
       </w:hyperlink>
     </w:p>
@@ -317,7 +317,7 @@
       </w:pPr>
       <w:r>
         <w:rPr>
-          <w:rFonts w:ascii="Calibri" w:hAnsi="Calibri" w:eastAsia="Songti SC"/>
+          <w:rFonts w:ascii="Calibri" w:hAnsi="Calibri" w:eastAsia="Arial Unicode MS"/>
           <w:b/>
           <w:color w:val="285B9D"/>
           <w:sz w:val="21"/>
@@ -326,11 +326,11 @@
       </w:r>
       <w:r>
         <w:rPr>
-          <w:rFonts w:ascii="Calibri" w:hAnsi="Calibri" w:eastAsia="Songti SC"/>
+          <w:rFonts w:ascii="Calibri" w:hAnsi="Calibri" w:eastAsia="Arial Unicode MS"/>
           <w:color w:val="111827"/>
           <w:sz w:val="21"/>
         </w:rPr>
-        <w:t>通胀 今日 降温，当日计数 1，前一日计数 173。</w:t>
+        <w:t>能源 今日 升温，当日计数 1，前一日计数 0。</w:t>
       </w:r>
     </w:p>
     <w:p>
@@ -340,7 +340,7 @@
       </w:pPr>
       <w:r>
         <w:rPr>
-          <w:rFonts w:ascii="Calibri" w:hAnsi="Calibri" w:eastAsia="Songti SC"/>
+          <w:rFonts w:ascii="Calibri" w:hAnsi="Calibri" w:eastAsia="Arial Unicode MS"/>
           <w:b/>
           <w:color w:val="285B9D"/>
           <w:sz w:val="21"/>
@@ -352,9 +352,9 @@
           <w:rPr>
             <w:color w:val="285B9D"/>
             <w:u w:val="single"/>
-            <w:rFonts w:eastAsia="Songti SC" w:ascii="Calibri" w:hAnsi="Calibri"/>
+            <w:rFonts w:eastAsia="Arial Unicode MS" w:ascii="Calibri" w:hAnsi="Calibri"/>
           </w:rPr>
-          <w:t>风险矩阵最需要跟踪的是 宏观通胀传导：半导体瓶颈环节：订单与毛利率验证 (2026-08-12)。</w:t>
+          <w:t>风险矩阵最需要跟踪的是 AI 基础设施：prior research notes— AI 数据中心电力与电网设备瓶颈：2027 年 capex run-rate 能否被 powered-...。</w:t>
         </w:r>
       </w:hyperlink>
     </w:p>
@@ -365,7 +365,7 @@
       </w:pPr>
       <w:r>
         <w:rPr>
-          <w:rFonts w:ascii="Calibri" w:hAnsi="Calibri" w:eastAsia="Songti SC"/>
+          <w:rFonts w:ascii="Calibri" w:hAnsi="Calibri" w:eastAsia="Arial Unicode MS"/>
           <w:b/>
           <w:color w:val="285B9D"/>
           <w:sz w:val="21"/>
@@ -377,9 +377,9 @@
           <w:rPr>
             <w:color w:val="285B9D"/>
             <w:u w:val="single"/>
-            <w:rFonts w:eastAsia="Songti SC" w:ascii="Calibri" w:hAnsi="Calibri"/>
+            <w:rFonts w:eastAsia="Arial Unicode MS" w:ascii="Calibri" w:hAnsi="Calibri"/>
           </w:rPr>
-          <w:t>宏观通胀传导 今日 1 条、近七日 1588 条，风险信号 991 条。</w:t>
+          <w:t>宏观通胀传导 今日 1 条、近七日 1257 条，风险信号 797 条。</w:t>
         </w:r>
       </w:hyperlink>
     </w:p>
@@ -403,7 +403,7 @@
           <w:p>
             <w:r>
               <w:rPr>
-                <w:rFonts w:ascii="Calibri" w:hAnsi="Calibri" w:eastAsia="Songti SC"/>
+                <w:rFonts w:ascii="Calibri" w:hAnsi="Calibri" w:eastAsia="Arial Unicode MS"/>
                 <w:b/>
                 <w:color w:val="7A5A00"/>
                 <w:sz w:val="21"/>
@@ -412,7 +412,7 @@
             </w:r>
             <w:r>
               <w:rPr>
-                <w:rFonts w:ascii="Calibri" w:hAnsi="Calibri" w:eastAsia="Songti SC"/>
+                <w:rFonts w:ascii="Calibri" w:hAnsi="Calibri" w:eastAsia="Arial Unicode MS"/>
                 <w:color w:val="7C2D12"/>
                 <w:sz w:val="21"/>
               </w:rPr>
@@ -452,7 +452,7 @@
               <a:graphicData uri="http://schemas.openxmlformats.org/drawingml/2006/picture">
                 <pic:pic>
                   <pic:nvPicPr>
-                    <pic:cNvPr id="0" name="daily-brief-2026-08-18-web-trend.png"/>
+                    <pic:cNvPr id="0" name="daily-brief-2026-08-19-web-trend.png"/>
                     <pic:cNvPicPr/>
                   </pic:nvPicPr>
                   <pic:blipFill>
@@ -483,7 +483,7 @@
       </w:pPr>
       <w:r>
         <w:rPr>
-          <w:rFonts w:ascii="Calibri" w:hAnsi="Calibri" w:eastAsia="Songti SC"/>
+          <w:rFonts w:ascii="Calibri" w:hAnsi="Calibri" w:eastAsia="Arial Unicode MS"/>
           <w:b w:val="0"/>
           <w:i/>
           <w:color w:val="667085"/>
@@ -509,7 +509,7 @@
               <a:graphicData uri="http://schemas.openxmlformats.org/drawingml/2006/picture">
                 <pic:pic>
                   <pic:nvPicPr>
-                    <pic:cNvPr id="0" name="daily-brief-2026-08-18-web-chains.png"/>
+                    <pic:cNvPr id="0" name="daily-brief-2026-08-19-web-chains.png"/>
                     <pic:cNvPicPr/>
                   </pic:nvPicPr>
                   <pic:blipFill>
@@ -540,7 +540,7 @@
       </w:pPr>
       <w:r>
         <w:rPr>
-          <w:rFonts w:ascii="Calibri" w:hAnsi="Calibri" w:eastAsia="Songti SC"/>
+          <w:rFonts w:ascii="Calibri" w:hAnsi="Calibri" w:eastAsia="Arial Unicode MS"/>
           <w:b w:val="0"/>
           <w:i/>
           <w:color w:val="667085"/>
@@ -571,7 +571,7 @@
               <a:graphicData uri="http://schemas.openxmlformats.org/drawingml/2006/picture">
                 <pic:pic>
                   <pic:nvPicPr>
-                    <pic:cNvPr id="0" name="daily-brief-2026-08-18-web-risk.png"/>
+                    <pic:cNvPr id="0" name="daily-brief-2026-08-19-web-risk.png"/>
                     <pic:cNvPicPr/>
                   </pic:nvPicPr>
                   <pic:blipFill>
@@ -602,7 +602,7 @@
       </w:pPr>
       <w:r>
         <w:rPr>
-          <w:rFonts w:ascii="Calibri" w:hAnsi="Calibri" w:eastAsia="Songti SC"/>
+          <w:rFonts w:ascii="Calibri" w:hAnsi="Calibri" w:eastAsia="Arial Unicode MS"/>
           <w:b w:val="0"/>
           <w:i/>
           <w:color w:val="667085"/>
@@ -633,7 +633,7 @@
               <a:graphicData uri="http://schemas.openxmlformats.org/drawingml/2006/picture">
                 <pic:pic>
                   <pic:nvPicPr>
-                    <pic:cNvPr id="0" name="daily-brief-2026-08-18-web-heatmap.png"/>
+                    <pic:cNvPr id="0" name="daily-brief-2026-08-19-web-heatmap.png"/>
                     <pic:cNvPicPr/>
                   </pic:nvPicPr>
                   <pic:blipFill>
@@ -664,7 +664,7 @@
       </w:pPr>
       <w:r>
         <w:rPr>
-          <w:rFonts w:ascii="Calibri" w:hAnsi="Calibri" w:eastAsia="Songti SC"/>
+          <w:rFonts w:ascii="Calibri" w:hAnsi="Calibri" w:eastAsia="Arial Unicode MS"/>
           <w:b w:val="0"/>
           <w:i/>
           <w:color w:val="667085"/>
@@ -687,13 +687,13 @@
       </w:pPr>
       <w:r>
         <w:rPr>
-          <w:rFonts w:ascii="Calibri" w:hAnsi="Calibri" w:eastAsia="Songti SC"/>
+          <w:rFonts w:ascii="Calibri" w:hAnsi="Calibri" w:eastAsia="Arial Unicode MS"/>
           <w:b/>
           <w:i w:val="0"/>
           <w:color w:val="0B2545"/>
           <w:sz w:val="23"/>
         </w:rPr>
-        <w:t>1. SQM 近端催化剂</w:t>
+        <w:t>1. research discussion Session Brief</w:t>
       </w:r>
     </w:p>
     <w:p>
@@ -702,13 +702,13 @@
       </w:pPr>
       <w:r>
         <w:rPr>
-          <w:rFonts w:ascii="Calibri" w:hAnsi="Calibri" w:eastAsia="Songti SC"/>
+          <w:rFonts w:ascii="Calibri" w:hAnsi="Calibri" w:eastAsia="Arial Unicode MS"/>
           <w:b w:val="0"/>
           <w:i w:val="0"/>
           <w:color w:val="667085"/>
           <w:sz w:val="17"/>
         </w:rPr>
-        <w:t>未识别 · AI 基础设施 · score 36.6</w:t>
+        <w:t>未识别 · 宏观通胀传导 · score 34.0</w:t>
       </w:r>
     </w:p>
     <w:p>
@@ -717,13 +717,13 @@
       </w:pPr>
       <w:r>
         <w:rPr>
-          <w:rFonts w:ascii="Calibri" w:hAnsi="Calibri" w:eastAsia="Songti SC"/>
+          <w:rFonts w:ascii="Calibri" w:hAnsi="Calibri" w:eastAsia="Arial Unicode MS"/>
           <w:b w:val="0"/>
           <w:i w:val="0"/>
           <w:color w:val="334155"/>
           <w:sz w:val="20"/>
         </w:rPr>
-        <w:t>截至本报告写作日，SQM 的近端催化剂主线是“锂价与销量修复 + Codelco/SQM 合资落地后的 Salar Futuro 许可进展 + 碘和 SPN 业务的供给偏紧”。SQM 2026 Q1 收入为 US$1,760.1 million、同比增...</w:t>
+        <w:t>Board ID: eba91012-1ebf-46f5-9381-13d0e7468952 - Shared Agent Route session: 0e689ed9-0c57-48e7-a2e1-132a368bc178 - Root topic: RDDT入标会不会放大meme与被动资金反身性？ - Current c...</w:t>
       </w:r>
     </w:p>
     <w:p>
@@ -732,7 +732,7 @@
       </w:pPr>
       <w:r>
         <w:rPr>
-          <w:rFonts w:ascii="Calibri" w:hAnsi="Calibri" w:eastAsia="Songti SC"/>
+          <w:rFonts w:ascii="Calibri" w:hAnsi="Calibri" w:eastAsia="Arial Unicode MS"/>
           <w:b w:val="0"/>
           <w:i w:val="0"/>
           <w:color w:val="667085"/>
@@ -745,9 +745,9 @@
           <w:rPr>
             <w:color w:val="285B9D"/>
             <w:u w:val="single"/>
-            <w:rFonts w:eastAsia="Songti SC" w:ascii="Calibri" w:hAnsi="Calibri"/>
+            <w:rFonts w:eastAsia="Arial Unicode MS" w:ascii="Calibri" w:hAnsi="Calibri"/>
           </w:rPr>
-          <w:t>reports/archive-381a5c58628d</w:t>
+          <w:t>reports/archive-bbe07c7ebc6b</w:t>
         </w:r>
       </w:hyperlink>
     </w:p>
@@ -765,62 +765,7 @@
       </w:pPr>
       <w:r>
         <w:rPr>
-          <w:rFonts w:ascii="Calibri" w:hAnsi="Calibri" w:eastAsia="Songti SC"/>
-          <w:b/>
-          <w:i w:val="0"/>
-          <w:color w:val="0B2545"/>
-          <w:sz w:val="22"/>
-        </w:rPr>
-        <w:t>半导体瓶颈环节：订单与毛利率验证 (2026-08-12)</w:t>
-      </w:r>
-    </w:p>
-    <w:p>
-      <w:pPr>
-        <w:spacing w:before="0" w:after="60" w:line="264" w:lineRule="auto"/>
-      </w:pPr>
-      <w:r>
-        <w:rPr>
-          <w:rFonts w:ascii="Calibri" w:hAnsi="Calibri" w:eastAsia="Songti SC"/>
-          <w:b w:val="0"/>
-          <w:i w:val="0"/>
-          <w:color w:val="334155"/>
-          <w:sz w:val="20"/>
-        </w:rPr>
-        <w:t>宏观通胀传导，影响 5 / 概率 3</w:t>
-      </w:r>
-    </w:p>
-    <w:p>
-      <w:pPr>
-        <w:spacing w:before="0" w:after="160" w:line="264" w:lineRule="auto"/>
-      </w:pPr>
-      <w:r>
-        <w:rPr>
-          <w:rFonts w:ascii="Calibri" w:hAnsi="Calibri" w:eastAsia="Songti SC"/>
-          <w:b w:val="0"/>
-          <w:i w:val="0"/>
-          <w:color w:val="667085"/>
-          <w:sz w:val="17"/>
-        </w:rPr>
-        <w:t xml:space="preserve">Report: </w:t>
-      </w:r>
-      <w:hyperlink r:id="rId13">
-        <w:r>
-          <w:rPr>
-            <w:color w:val="285B9D"/>
-            <w:u w:val="single"/>
-            <w:rFonts w:eastAsia="Songti SC" w:ascii="Calibri" w:hAnsi="Calibri"/>
-          </w:rPr>
-          <w:t>reports/archive-4222e623d105</w:t>
-        </w:r>
-      </w:hyperlink>
-    </w:p>
-    <w:p>
-      <w:pPr>
-        <w:spacing w:before="0" w:after="40" w:line="264" w:lineRule="auto"/>
-      </w:pPr>
-      <w:r>
-        <w:rPr>
-          <w:rFonts w:ascii="Calibri" w:hAnsi="Calibri" w:eastAsia="Songti SC"/>
+          <w:rFonts w:ascii="Calibri" w:hAnsi="Calibri" w:eastAsia="Arial Unicode MS"/>
           <w:b/>
           <w:i w:val="0"/>
           <w:color w:val="0B2545"/>
@@ -835,7 +780,7 @@
       </w:pPr>
       <w:r>
         <w:rPr>
-          <w:rFonts w:ascii="Calibri" w:hAnsi="Calibri" w:eastAsia="Songti SC"/>
+          <w:rFonts w:ascii="Calibri" w:hAnsi="Calibri" w:eastAsia="Arial Unicode MS"/>
           <w:b w:val="0"/>
           <w:i w:val="0"/>
           <w:color w:val="334155"/>
@@ -850,7 +795,7 @@
       </w:pPr>
       <w:r>
         <w:rPr>
-          <w:rFonts w:ascii="Calibri" w:hAnsi="Calibri" w:eastAsia="Songti SC"/>
+          <w:rFonts w:ascii="Calibri" w:hAnsi="Calibri" w:eastAsia="Arial Unicode MS"/>
           <w:b w:val="0"/>
           <w:i w:val="0"/>
           <w:color w:val="667085"/>
@@ -858,12 +803,12 @@
         </w:rPr>
         <w:t xml:space="preserve">Report: </w:t>
       </w:r>
-      <w:hyperlink r:id="rId18">
+      <w:hyperlink r:id="rId13">
         <w:r>
           <w:rPr>
             <w:color w:val="285B9D"/>
             <w:u w:val="single"/>
-            <w:rFonts w:eastAsia="Songti SC" w:ascii="Calibri" w:hAnsi="Calibri"/>
+            <w:rFonts w:eastAsia="Arial Unicode MS" w:ascii="Calibri" w:hAnsi="Calibri"/>
           </w:rPr>
           <w:t>reports/archive-b4ec8ef3430e</w:t>
         </w:r>
@@ -875,7 +820,7 @@
       </w:pPr>
       <w:r>
         <w:rPr>
-          <w:rFonts w:ascii="Calibri" w:hAnsi="Calibri" w:eastAsia="Songti SC"/>
+          <w:rFonts w:ascii="Calibri" w:hAnsi="Calibri" w:eastAsia="Arial Unicode MS"/>
           <w:b/>
           <w:i w:val="0"/>
           <w:color w:val="0B2545"/>
@@ -890,7 +835,7 @@
       </w:pPr>
       <w:r>
         <w:rPr>
-          <w:rFonts w:ascii="Calibri" w:hAnsi="Calibri" w:eastAsia="Songti SC"/>
+          <w:rFonts w:ascii="Calibri" w:hAnsi="Calibri" w:eastAsia="Arial Unicode MS"/>
           <w:b w:val="0"/>
           <w:i w:val="0"/>
           <w:color w:val="334155"/>
@@ -905,7 +850,62 @@
       </w:pPr>
       <w:r>
         <w:rPr>
-          <w:rFonts w:ascii="Calibri" w:hAnsi="Calibri" w:eastAsia="Songti SC"/>
+          <w:rFonts w:ascii="Calibri" w:hAnsi="Calibri" w:eastAsia="Arial Unicode MS"/>
+          <w:b w:val="0"/>
+          <w:i w:val="0"/>
+          <w:color w:val="667085"/>
+          <w:sz w:val="17"/>
+        </w:rPr>
+        <w:t xml:space="preserve">Report: </w:t>
+      </w:r>
+      <w:hyperlink r:id="rId18">
+        <w:r>
+          <w:rPr>
+            <w:color w:val="285B9D"/>
+            <w:u w:val="single"/>
+            <w:rFonts w:eastAsia="Arial Unicode MS" w:ascii="Calibri" w:hAnsi="Calibri"/>
+          </w:rPr>
+          <w:t>reports/archive-497a81b51eee</w:t>
+        </w:r>
+      </w:hyperlink>
+    </w:p>
+    <w:p>
+      <w:pPr>
+        <w:spacing w:before="0" w:after="40" w:line="264" w:lineRule="auto"/>
+      </w:pPr>
+      <w:r>
+        <w:rPr>
+          <w:rFonts w:ascii="Calibri" w:hAnsi="Calibri" w:eastAsia="Arial Unicode MS"/>
+          <w:b/>
+          <w:i w:val="0"/>
+          <w:color w:val="0B2545"/>
+          <w:sz w:val="22"/>
+        </w:rPr>
+        <w:t>AI数据中心电力瓶颈量化：电网并网排队、设备交付周期与hyperscaler电力采购（截至2026-08-16）</w:t>
+      </w:r>
+    </w:p>
+    <w:p>
+      <w:pPr>
+        <w:spacing w:before="0" w:after="60" w:line="264" w:lineRule="auto"/>
+      </w:pPr>
+      <w:r>
+        <w:rPr>
+          <w:rFonts w:ascii="Calibri" w:hAnsi="Calibri" w:eastAsia="Arial Unicode MS"/>
+          <w:b w:val="0"/>
+          <w:i w:val="0"/>
+          <w:color w:val="334155"/>
+          <w:sz w:val="20"/>
+        </w:rPr>
+        <w:t>电力与电网，影响 5 / 概率 2</w:t>
+      </w:r>
+    </w:p>
+    <w:p>
+      <w:pPr>
+        <w:spacing w:before="0" w:after="160" w:line="264" w:lineRule="auto"/>
+      </w:pPr>
+      <w:r>
+        <w:rPr>
+          <w:rFonts w:ascii="Calibri" w:hAnsi="Calibri" w:eastAsia="Arial Unicode MS"/>
           <w:b w:val="0"/>
           <w:i w:val="0"/>
           <w:color w:val="667085"/>
@@ -918,9 +918,9 @@
           <w:rPr>
             <w:color w:val="285B9D"/>
             <w:u w:val="single"/>
-            <w:rFonts w:eastAsia="Songti SC" w:ascii="Calibri" w:hAnsi="Calibri"/>
+            <w:rFonts w:eastAsia="Arial Unicode MS" w:ascii="Calibri" w:hAnsi="Calibri"/>
           </w:rPr>
-          <w:t>reports/archive-497a81b51eee</w:t>
+          <w:t>reports/archive-fb62d5d075f2</w:t>
         </w:r>
       </w:hyperlink>
     </w:p>
@@ -961,7 +961,7 @@
             <w:r/>
             <w:r>
               <w:rPr>
-                <w:rFonts w:ascii="Calibri" w:hAnsi="Calibri" w:eastAsia="Songti SC"/>
+                <w:rFonts w:ascii="Calibri" w:hAnsi="Calibri" w:eastAsia="Arial Unicode MS"/>
                 <w:b/>
                 <w:color w:val="475569"/>
                 <w:sz w:val="18"/>
@@ -984,7 +984,7 @@
             <w:r/>
             <w:r>
               <w:rPr>
-                <w:rFonts w:ascii="Calibri" w:hAnsi="Calibri" w:eastAsia="Songti SC"/>
+                <w:rFonts w:ascii="Calibri" w:hAnsi="Calibri" w:eastAsia="Arial Unicode MS"/>
                 <w:b/>
                 <w:color w:val="475569"/>
                 <w:sz w:val="18"/>
@@ -1007,7 +1007,7 @@
             <w:r/>
             <w:r>
               <w:rPr>
-                <w:rFonts w:ascii="Calibri" w:hAnsi="Calibri" w:eastAsia="Songti SC"/>
+                <w:rFonts w:ascii="Calibri" w:hAnsi="Calibri" w:eastAsia="Arial Unicode MS"/>
                 <w:b/>
                 <w:color w:val="475569"/>
                 <w:sz w:val="18"/>
@@ -1030,7 +1030,7 @@
             <w:r/>
             <w:r>
               <w:rPr>
-                <w:rFonts w:ascii="Calibri" w:hAnsi="Calibri" w:eastAsia="Songti SC"/>
+                <w:rFonts w:ascii="Calibri" w:hAnsi="Calibri" w:eastAsia="Arial Unicode MS"/>
                 <w:b/>
                 <w:color w:val="475569"/>
                 <w:sz w:val="18"/>
@@ -1053,7 +1053,7 @@
             <w:r/>
             <w:r>
               <w:rPr>
-                <w:rFonts w:ascii="Calibri" w:hAnsi="Calibri" w:eastAsia="Songti SC"/>
+                <w:rFonts w:ascii="Calibri" w:hAnsi="Calibri" w:eastAsia="Arial Unicode MS"/>
                 <w:b/>
                 <w:color w:val="475569"/>
                 <w:sz w:val="18"/>
@@ -1076,12 +1076,12 @@
             <w:r/>
             <w:r>
               <w:rPr>
-                <w:rFonts w:ascii="Calibri" w:hAnsi="Calibri" w:eastAsia="Songti SC"/>
+                <w:rFonts w:ascii="Calibri" w:hAnsi="Calibri" w:eastAsia="Arial Unicode MS"/>
                 <w:b w:val="0"/>
                 <w:color w:val="111827"/>
                 <w:sz w:val="17"/>
               </w:rPr>
-              <w:t>SQM 近端催化剂</w:t>
+              <w:t>research discussion Session Brief</w:t>
             </w:r>
           </w:p>
         </w:tc>
@@ -1097,7 +1097,7 @@
             <w:r/>
             <w:r>
               <w:rPr>
-                <w:rFonts w:ascii="Calibri" w:hAnsi="Calibri" w:eastAsia="Songti SC"/>
+                <w:rFonts w:ascii="Calibri" w:hAnsi="Calibri" w:eastAsia="Arial Unicode MS"/>
                 <w:b w:val="0"/>
                 <w:color w:val="111827"/>
                 <w:sz w:val="16"/>
@@ -1118,12 +1118,12 @@
             <w:r/>
             <w:r>
               <w:rPr>
-                <w:rFonts w:ascii="Calibri" w:hAnsi="Calibri" w:eastAsia="Songti SC"/>
+                <w:rFonts w:ascii="Calibri" w:hAnsi="Calibri" w:eastAsia="Arial Unicode MS"/>
                 <w:b w:val="0"/>
                 <w:color w:val="111827"/>
                 <w:sz w:val="16"/>
               </w:rPr>
-              <w:t>AI 基础设施</w:t>
+              <w:t>宏观通胀传导</w:t>
             </w:r>
           </w:p>
         </w:tc>
@@ -1140,12 +1140,12 @@
             <w:r/>
             <w:r>
               <w:rPr>
-                <w:rFonts w:ascii="Calibri" w:hAnsi="Calibri" w:eastAsia="Songti SC"/>
+                <w:rFonts w:ascii="Calibri" w:hAnsi="Calibri" w:eastAsia="Arial Unicode MS"/>
                 <w:b/>
                 <w:color w:val="111827"/>
                 <w:sz w:val="17"/>
               </w:rPr>
-              <w:t>36.6</w:t>
+              <w:t>34.0</w:t>
             </w:r>
           </w:p>
         </w:tc>
@@ -1162,7 +1162,7 @@
             <w:r/>
             <w:r>
               <w:rPr>
-                <w:rFonts w:ascii="Calibri" w:hAnsi="Calibri" w:eastAsia="Songti SC"/>
+                <w:rFonts w:ascii="Calibri" w:hAnsi="Calibri" w:eastAsia="Arial Unicode MS"/>
                 <w:b w:val="0"/>
                 <w:color w:val="111827"/>
                 <w:sz w:val="16"/>
@@ -1179,7 +1179,7 @@
       </w:pPr>
       <w:r>
         <w:rPr>
-          <w:rFonts w:ascii="Calibri" w:hAnsi="Calibri" w:eastAsia="Songti SC"/>
+          <w:rFonts w:ascii="Calibri" w:hAnsi="Calibri" w:eastAsia="Arial Unicode MS"/>
           <w:b w:val="0"/>
           <w:i/>
           <w:color w:val="667085"/>
@@ -1209,7 +1209,7 @@
     </w:pPr>
     <w:r>
       <w:rPr>
-        <w:rFonts w:ascii="Calibri" w:hAnsi="Calibri" w:eastAsia="Songti SC"/>
+        <w:rFonts w:ascii="Calibri" w:hAnsi="Calibri" w:eastAsia="Arial Unicode MS"/>
         <w:color w:val="667085"/>
         <w:sz w:val="17"/>
       </w:rPr>
@@ -1228,7 +1228,7 @@
     <w:r/>
     <w:r>
       <w:rPr>
-        <w:rFonts w:ascii="Calibri" w:hAnsi="Calibri" w:eastAsia="Songti SC"/>
+        <w:rFonts w:ascii="Calibri" w:hAnsi="Calibri" w:eastAsia="Arial Unicode MS"/>
         <w:color w:val="667085"/>
         <w:sz w:val="18"/>
       </w:rPr>
@@ -1605,7 +1605,7 @@
       <w:spacing w:after="120" w:line="264" w:lineRule="auto"/>
     </w:pPr>
     <w:rPr>
-      <w:rFonts w:ascii="Calibri" w:hAnsi="Calibri" w:eastAsia="Songti SC"/>
+      <w:rFonts w:ascii="Calibri" w:hAnsi="Calibri" w:eastAsia="Arial Unicode MS"/>
       <w:b w:val="0"/>
       <w:color w:val="111827"/>
       <w:sz w:val="22"/>
@@ -1670,7 +1670,7 @@
       <w:outlineLvl w:val="0"/>
     </w:pPr>
     <w:rPr>
-      <w:rFonts w:asciiTheme="majorHAnsi" w:eastAsiaTheme="majorEastAsia" w:hAnsiTheme="majorHAnsi" w:cstheme="majorBidi" w:ascii="Calibri" w:hAnsi="Calibri" w:eastAsia="Songti SC"/>
+      <w:rFonts w:asciiTheme="majorHAnsi" w:eastAsiaTheme="majorEastAsia" w:hAnsiTheme="majorHAnsi" w:cstheme="majorBidi" w:ascii="Calibri" w:hAnsi="Calibri" w:eastAsia="Arial Unicode MS"/>
       <w:b/>
       <w:bCs/>
       <w:color w:val="2E74B5"/>
@@ -1694,7 +1694,7 @@
       <w:outlineLvl w:val="1"/>
     </w:pPr>
     <w:rPr>
-      <w:rFonts w:asciiTheme="majorHAnsi" w:eastAsiaTheme="majorEastAsia" w:hAnsiTheme="majorHAnsi" w:cstheme="majorBidi" w:ascii="Calibri" w:hAnsi="Calibri" w:eastAsia="Songti SC"/>
+      <w:rFonts w:asciiTheme="majorHAnsi" w:eastAsiaTheme="majorEastAsia" w:hAnsiTheme="majorHAnsi" w:cstheme="majorBidi" w:ascii="Calibri" w:hAnsi="Calibri" w:eastAsia="Arial Unicode MS"/>
       <w:b/>
       <w:bCs/>
       <w:color w:val="2E74B5"/>
@@ -1718,7 +1718,7 @@
       <w:outlineLvl w:val="2"/>
     </w:pPr>
     <w:rPr>
-      <w:rFonts w:asciiTheme="majorHAnsi" w:eastAsiaTheme="majorEastAsia" w:hAnsiTheme="majorHAnsi" w:cstheme="majorBidi" w:ascii="Calibri" w:hAnsi="Calibri" w:eastAsia="Songti SC"/>
+      <w:rFonts w:asciiTheme="majorHAnsi" w:eastAsiaTheme="majorEastAsia" w:hAnsiTheme="majorHAnsi" w:cstheme="majorBidi" w:ascii="Calibri" w:hAnsi="Calibri" w:eastAsia="Arial Unicode MS"/>
       <w:b/>
       <w:bCs/>
       <w:color w:val="1F4D78"/>
@@ -1960,7 +1960,7 @@
       <w:contextualSpacing/>
     </w:pPr>
     <w:rPr>
-      <w:rFonts w:asciiTheme="majorHAnsi" w:eastAsiaTheme="majorEastAsia" w:hAnsiTheme="majorHAnsi" w:cstheme="majorBidi" w:ascii="Calibri" w:hAnsi="Calibri" w:eastAsia="Songti SC"/>
+      <w:rFonts w:asciiTheme="majorHAnsi" w:eastAsiaTheme="majorEastAsia" w:hAnsiTheme="majorHAnsi" w:cstheme="majorBidi" w:ascii="Calibri" w:hAnsi="Calibri" w:eastAsia="Arial Unicode MS"/>
       <w:b/>
       <w:color w:val="0B2545"/>
       <w:spacing w:val="5"/>
@@ -1998,7 +1998,7 @@
       </w:numPr>
     </w:pPr>
     <w:rPr>
-      <w:rFonts w:asciiTheme="majorHAnsi" w:eastAsiaTheme="majorEastAsia" w:hAnsiTheme="majorHAnsi" w:cstheme="majorBidi" w:ascii="Calibri" w:hAnsi="Calibri" w:eastAsia="Songti SC"/>
+      <w:rFonts w:asciiTheme="majorHAnsi" w:eastAsiaTheme="majorEastAsia" w:hAnsiTheme="majorHAnsi" w:cstheme="majorBidi" w:ascii="Calibri" w:hAnsi="Calibri" w:eastAsia="Arial Unicode MS"/>
       <w:b w:val="0"/>
       <w:i/>
       <w:iCs/>

</xml_diff>